<commit_message>
P0-E docs: consolidación del modelo de dominio, trazabilidad y contradicciones
- Índice normativo, matriz de trazabilidad e informe de contradicciones (C6–C18, N1–N10).
- DOMINIO corregido: K1–K14 comunicadas, K6 frente a 70 %, convivencia con P0-E.
- PROGRESO: publicación por tiempo, mapa y criterios de aceptación.
- Corrige errores previos, incluido el estado del copiloto IA.

Solo documentación: sin cambios de código, esquema, pruebas, datos ni producción.

Co-Authored-By: Claude Opus 5.5 <noreply@anthropic.com>
</commit_message>
<xml_diff>
--- a/docs/p0e/APRENDIZAJE_TEORICO_VORTICE.docx
+++ b/docs/p0e/APRENDIZAJE_TEORICO_VORTICE.docx
@@ -30,6 +30,48 @@
     <w:p>
       <w:pPr>
         <w:pStyle w:val="FirstParagraph"/>
+      </w:pPr>
+      <w:r>
+        <w:rPr>
+          <w:b/>
+          <w:bCs/>
+        </w:rPr>
+        <w:t xml:space="preserve">Este resumen no es normativo.</w:t>
+      </w:r>
+      <w:r>
+        <w:t xml:space="preserve"> </w:t>
+      </w:r>
+      <w:r>
+        <w:t xml:space="preserve">Las reglas viven en los documentos indicados en</w:t>
+      </w:r>
+      <w:r>
+        <w:t xml:space="preserve"> </w:t>
+      </w:r>
+      <w:r>
+        <w:rPr>
+          <w:rStyle w:val="VerbatimChar"/>
+        </w:rPr>
+        <w:t xml:space="preserve">README.md</w:t>
+      </w:r>
+      <w:r>
+        <w:t xml:space="preserve">. Versión corregida el 30 de octubre de 2026; ver</w:t>
+      </w:r>
+      <w:r>
+        <w:t xml:space="preserve"> </w:t>
+      </w:r>
+      <w:r>
+        <w:rPr>
+          <w:rStyle w:val="VerbatimChar"/>
+        </w:rPr>
+        <w:t xml:space="preserve">CONTRADICCIONES_Y_PREGUNTAS.md</w:t>
+      </w:r>
+      <w:r>
+        <w:t xml:space="preserve">.</w:t>
+      </w:r>
+    </w:p>
+    <w:p>
+      <w:pPr>
+        <w:pStyle w:val="BodyText"/>
       </w:pPr>
       <w:r>
         <w:t xml:space="preserve">Vórtice ha avanzado, en las últimas semanas, mucho más en</w:t>
@@ -253,7 +295,7 @@
         <w:t xml:space="preserve"> </w:t>
       </w:r>
       <w:r>
-        <w:t xml:space="preserve">Cada módulo termina con una evaluación de cierre; aprobarla abre el módulo siguiente.</w:t>
+        <w:t xml:space="preserve">Cada módulo termina con una evaluación de cierre; aprobarla abre el módulo siguiente. La regla P21 comunicada permitiría continuar tras agotar todos los intentos, por lo que esta consecuencia está pendiente de ratificación (D2).</w:t>
       </w:r>
     </w:p>
     <w:p>
@@ -831,7 +873,17 @@
         <w:pStyle w:val="FirstParagraph"/>
       </w:pPr>
       <w:r>
-        <w:t xml:space="preserve">Respondidas «sí» el 30 de octubre de 2026. Pendientes de revisión independiente.</w:t>
+        <w:t xml:space="preserve">Respondidas «sí» el 30 de octubre de 2026. Comunicadas, pendientes de revisión independiente.</w:t>
+      </w:r>
+      <w:r>
+        <w:t xml:space="preserve"> </w:t>
+      </w:r>
+      <w:r>
+        <w:rPr>
+          <w:b/>
+          <w:bCs/>
+        </w:rPr>
+        <w:t xml:space="preserve">Ninguna está construida.</w:t>
       </w:r>
     </w:p>
     <w:tbl>
@@ -1356,7 +1408,7 @@
               <w:pStyle w:val="Compact"/>
             </w:pPr>
             <w:r>
-              <w:t xml:space="preserve">2 en las evaluaciones de práctica y 3 en la evaluación de cierre (E2). El intento se consume al entregar.</w:t>
+              <w:t xml:space="preserve">2 en E1, E3 y E4, y 3 en E2. El intento se consume al entregar.</w:t>
             </w:r>
           </w:p>
         </w:tc>
@@ -1418,31 +1470,31 @@
           </w:p>
         </w:tc>
       </w:tr>
-      <w:tr>
-        <w:tc>
-          <w:tcPr/>
-          <w:p>
-            <w:pPr>
-              <w:pStyle w:val="Compact"/>
-            </w:pPr>
-            <w:r>
-              <w:t xml:space="preserve">Historial</w:t>
-            </w:r>
-          </w:p>
-        </w:tc>
-        <w:tc>
-          <w:tcPr/>
-          <w:p>
-            <w:pPr>
-              <w:pStyle w:val="Compact"/>
-            </w:pPr>
-            <w:r>
-              <w:t xml:space="preserve">Los intentos antiguos no se reescriben ni se renumeran (P7, propuesta de conservación del historial).</w:t>
-            </w:r>
-          </w:p>
-        </w:tc>
-      </w:tr>
     </w:tbl>
+    <w:p>
+      <w:pPr>
+        <w:pStyle w:val="BodyText"/>
+      </w:pPr>
+      <w:r>
+        <w:t xml:space="preserve">El tratamiento del historial (P7)</w:t>
+      </w:r>
+      <w:r>
+        <w:t xml:space="preserve"> </w:t>
+      </w:r>
+      <w:r>
+        <w:rPr>
+          <w:b/>
+          <w:bCs/>
+        </w:rPr>
+        <w:t xml:space="preserve">no</w:t>
+      </w:r>
+      <w:r>
+        <w:t xml:space="preserve"> </w:t>
+      </w:r>
+      <w:r>
+        <w:t xml:space="preserve">es una regla aprobada: es una propuesta (sección 9).</w:t>
+      </w:r>
+    </w:p>
     <w:bookmarkEnd w:id="17"/>
     <w:bookmarkStart w:id="19" w:name="X37217dfc58b48177d92ce6fd90ba25c073e8a1e"/>
     <w:p>
@@ -1476,7 +1528,7 @@
               <w:pStyle w:val="Compact"/>
             </w:pPr>
             <w:r>
-              <w:t xml:space="preserve">Rango de logro</w:t>
+              <w:t xml:space="preserve">Rango de logro (comunicado, pendiente de D3)</w:t>
             </w:r>
           </w:p>
         </w:tc>
@@ -1603,7 +1655,7 @@
               <w:pStyle w:val="Compact"/>
             </w:pPr>
             <w:r>
-              <w:t xml:space="preserve">Avance</w:t>
+              <w:t xml:space="preserve">Sin aviso especial</w:t>
             </w:r>
           </w:p>
         </w:tc>
@@ -1676,7 +1728,23 @@
         <w:t xml:space="preserve"> </w:t>
       </w:r>
       <w:r>
-        <w:t xml:space="preserve">Con los contenidos asociados a cada pregunta, la frase «contenidos que no logró» deja de significar «el módulo completo» y pasa a significar «sumar fracciones», «comparar números», etc. El repaso se vuelve específico.</w:t>
+        <w:t xml:space="preserve">Con contenidos asociados a cada pregunta, «contenidos que no logró» podría pasar de «el módulo completo» a contenidos concretos.</w:t>
+      </w:r>
+      <w:r>
+        <w:t xml:space="preserve"> </w:t>
+      </w:r>
+      <w:r>
+        <w:rPr>
+          <w:b/>
+          <w:bCs/>
+        </w:rPr>
+        <w:t xml:space="preserve">El 70 % de una evaluación y K6 son medidas distintas, y su relación no está definida</w:t>
+      </w:r>
+      <w:r>
+        <w:t xml:space="preserve"> </w:t>
+      </w:r>
+      <w:r>
+        <w:t xml:space="preserve">(N1).</w:t>
       </w:r>
     </w:p>
     <w:bookmarkStart w:id="18" w:name="X297e344ac3fba4f01b2e03cb5faf15770e83d73"/>
@@ -1781,63 +1849,31 @@
               <w:pStyle w:val="Compact"/>
             </w:pPr>
             <w:r>
-              <w:t xml:space="preserve">Las</w:t>
-            </w:r>
-            <w:r>
-              <w:t xml:space="preserve"> </w:t>
-            </w:r>
-            <w:r>
-              <w:rPr>
-                <w:b/>
-                <w:bCs/>
-              </w:rPr>
-              <w:t xml:space="preserve">prácticas</w:t>
-            </w:r>
-            <w:r>
-              <w:t xml:space="preserve"> </w:t>
-            </w:r>
-            <w:r>
-              <w:t xml:space="preserve">(formativas) dan feedback inmediato. La</w:t>
-            </w:r>
-            <w:r>
-              <w:t xml:space="preserve"> </w:t>
-            </w:r>
-            <w:r>
-              <w:rPr>
-                <w:b/>
-                <w:bCs/>
-              </w:rPr>
-              <w:t xml:space="preserve">evaluación de cierre</w:t>
-            </w:r>
-            <w:r>
-              <w:t xml:space="preserve"> </w:t>
-            </w:r>
-            <w:r>
-              <w:t xml:space="preserve">mantiene el retraso para que nadie deduzca la pauta.</w:t>
-            </w:r>
-          </w:p>
-        </w:tc>
-      </w:tr>
-      <w:tr>
-        <w:tc>
-          <w:tcPr/>
-          <w:p>
-            <w:pPr>
-              <w:pStyle w:val="Compact"/>
-            </w:pPr>
-            <w:r>
-              <w:t xml:space="preserve">Compuerta binaria contra frontera de aprendizaje</w:t>
-            </w:r>
-          </w:p>
-        </w:tc>
-        <w:tc>
-          <w:tcPr/>
-          <w:p>
-            <w:pPr>
-              <w:pStyle w:val="Compact"/>
-            </w:pPr>
-            <w:r>
-              <w:t xml:space="preserve">La compuerta del 70 % queda como política gruesa; el modelo de conocimiento opera por debajo, con más detalle.</w:t>
+              <w:t xml:space="preserve">K11 lo plantea así, pero sigue en conflicto con la regla aprobada y depende de P16 (C6).</w:t>
+            </w:r>
+          </w:p>
+        </w:tc>
+      </w:tr>
+      <w:tr>
+        <w:tc>
+          <w:tcPr/>
+          <w:p>
+            <w:pPr>
+              <w:pStyle w:val="Compact"/>
+            </w:pPr>
+            <w:r>
+              <w:t xml:space="preserve">Módulo abierto por P21 contra contenido «bloqueado» en el mapa</w:t>
+            </w:r>
+          </w:p>
+        </w:tc>
+        <w:tc>
+          <w:tcPr/>
+          <w:p>
+            <w:pPr>
+              <w:pStyle w:val="Compact"/>
+            </w:pPr>
+            <w:r>
+              <w:t xml:space="preserve">Sin resolver (C9, N3).</w:t>
             </w:r>
           </w:p>
         </w:tc>
@@ -2516,13 +2552,40 @@
       </w:r>
     </w:p>
     <w:bookmarkEnd w:id="24"/>
-    <w:bookmarkStart w:id="25" w:name="X91124bbd0f0902232806ef85197e02588728a63"/>
+    <w:bookmarkStart w:id="25" w:name="mensajes"/>
     <w:p>
       <w:pPr>
         <w:pStyle w:val="Heading2"/>
       </w:pPr>
       <w:r>
-        <w:t xml:space="preserve">10.3. Mensajes compatibles con la realidad actual</w:t>
+        <w:t xml:space="preserve">10.3. Mensajes</w:t>
+      </w:r>
+    </w:p>
+    <w:p>
+      <w:pPr>
+        <w:pStyle w:val="FirstParagraph"/>
+      </w:pPr>
+      <w:r>
+        <w:t xml:space="preserve">Hoy no hay repaso por contenido ni modelo de conocimiento, y P21 cambiaría el sentido de «avanzas cuando demuestras». Frases como «sabes exactamente qué repasar» o «nadie avanza sin entender» deben revisarse antes de usarse (C12, N7).</w:t>
+      </w:r>
+    </w:p>
+    <w:bookmarkEnd w:id="25"/>
+    <w:bookmarkEnd w:id="26"/>
+    <w:bookmarkStart w:id="27" w:name="lo-que-no-hacemos-todavía-y-por-qué"/>
+    <w:p>
+      <w:pPr>
+        <w:pStyle w:val="Heading1"/>
+      </w:pPr>
+      <w:r>
+        <w:t xml:space="preserve">11. Lo que no hacemos todavía (y por qué)</w:t>
+      </w:r>
+    </w:p>
+    <w:p>
+      <w:pPr>
+        <w:pStyle w:val="FirstParagraph"/>
+      </w:pPr>
+      <w:r>
+        <w:t xml:space="preserve">Estas salvaguardas provienen del informe y de las decisiones de la dirección:</w:t>
       </w:r>
     </w:p>
     <w:p>
@@ -2534,7 +2597,7 @@
         </w:numPr>
       </w:pPr>
       <w:r>
-        <w:t xml:space="preserve">«Avanzar es aprender.»</w:t>
+        <w:t xml:space="preserve">El algoritmo no crea prerrequisitos curriculares sin revisión humana.</w:t>
       </w:r>
     </w:p>
     <w:p>
@@ -2546,7 +2609,7 @@
         </w:numPr>
       </w:pPr>
       <w:r>
-        <w:t xml:space="preserve">«Aquí avanzas cuando demuestras que aprendiste.»</w:t>
+        <w:t xml:space="preserve">No se etiqueta de forma permanente a un estudiante a partir de un diagnóstico breve.</w:t>
       </w:r>
     </w:p>
     <w:p>
@@ -2558,26 +2621,7 @@
         </w:numPr>
       </w:pPr>
       <w:r>
-        <w:t xml:space="preserve">«Si no lo logras, sabes exactamente qué repasar.»</w:t>
-      </w:r>
-    </w:p>
-    <w:bookmarkEnd w:id="25"/>
-    <w:bookmarkEnd w:id="26"/>
-    <w:bookmarkStart w:id="27" w:name="lo-que-no-hacemos-todavía-y-por-qué"/>
-    <w:p>
-      <w:pPr>
-        <w:pStyle w:val="Heading1"/>
-      </w:pPr>
-      <w:r>
-        <w:t xml:space="preserve">11. Lo que no hacemos todavía (y por qué)</w:t>
-      </w:r>
-    </w:p>
-    <w:p>
-      <w:pPr>
-        <w:pStyle w:val="FirstParagraph"/>
-      </w:pPr>
-      <w:r>
-        <w:t xml:space="preserve">Estas salvaguardas provienen del informe y de las decisiones de la dirección:</w:t>
+        <w:t xml:space="preserve">El tiempo de respuesta no se usa como único indicador de dominio.</w:t>
       </w:r>
     </w:p>
     <w:p>
@@ -2585,11 +2629,11 @@
         <w:pStyle w:val="Compact"/>
         <w:numPr>
           <w:ilvl w:val="0"/>
-          <w:numId w:val="1004"/>
+          <w:numId w:val="1003"/>
         </w:numPr>
       </w:pPr>
       <w:r>
-        <w:t xml:space="preserve">El algoritmo no crea prerrequisitos curriculares sin revisión humana.</w:t>
+        <w:t xml:space="preserve">No se infieren condiciones clínicas a partir del desempeño.</w:t>
       </w:r>
     </w:p>
     <w:p>
@@ -2597,11 +2641,11 @@
         <w:pStyle w:val="Compact"/>
         <w:numPr>
           <w:ilvl w:val="0"/>
-          <w:numId w:val="1004"/>
+          <w:numId w:val="1003"/>
         </w:numPr>
       </w:pPr>
       <w:r>
-        <w:t xml:space="preserve">No se etiqueta de forma permanente a un estudiante a partir de un diagnóstico breve.</w:t>
+        <w:t xml:space="preserve">No se recomienda automáticamente reducir expectativas curriculares.</w:t>
       </w:r>
     </w:p>
     <w:p>
@@ -2609,43 +2653,7 @@
         <w:pStyle w:val="Compact"/>
         <w:numPr>
           <w:ilvl w:val="0"/>
-          <w:numId w:val="1004"/>
-        </w:numPr>
-      </w:pPr>
-      <w:r>
-        <w:t xml:space="preserve">El tiempo de respuesta no se usa como único indicador de dominio.</w:t>
-      </w:r>
-    </w:p>
-    <w:p>
-      <w:pPr>
-        <w:pStyle w:val="Compact"/>
-        <w:numPr>
-          <w:ilvl w:val="0"/>
-          <w:numId w:val="1004"/>
-        </w:numPr>
-      </w:pPr>
-      <w:r>
-        <w:t xml:space="preserve">No se infieren condiciones clínicas a partir del desempeño.</w:t>
-      </w:r>
-    </w:p>
-    <w:p>
-      <w:pPr>
-        <w:pStyle w:val="Compact"/>
-        <w:numPr>
-          <w:ilvl w:val="0"/>
-          <w:numId w:val="1004"/>
-        </w:numPr>
-      </w:pPr>
-      <w:r>
-        <w:t xml:space="preserve">No se recomienda automáticamente reducir expectativas curriculares.</w:t>
-      </w:r>
-    </w:p>
-    <w:p>
-      <w:pPr>
-        <w:pStyle w:val="Compact"/>
-        <w:numPr>
-          <w:ilvl w:val="0"/>
-          <w:numId w:val="1004"/>
+          <w:numId w:val="1003"/>
         </w:numPr>
       </w:pPr>
       <w:r>
@@ -2876,7 +2884,31 @@
               <w:pStyle w:val="Compact"/>
             </w:pPr>
             <w:r>
-              <w:t xml:space="preserve">Tutor IA</w:t>
+              <w:t xml:space="preserve">Copiloto conversacional</w:t>
+            </w:r>
+          </w:p>
+        </w:tc>
+        <w:tc>
+          <w:tcPr/>
+          <w:p>
+            <w:pPr>
+              <w:pStyle w:val="Compact"/>
+            </w:pPr>
+            <w:r>
+              <w:t xml:space="preserve">Existe en código; sin verificar en uso; no es adaptativo (C13)</w:t>
+            </w:r>
+          </w:p>
+        </w:tc>
+      </w:tr>
+      <w:tr>
+        <w:tc>
+          <w:tcPr/>
+          <w:p>
+            <w:pPr>
+              <w:pStyle w:val="Compact"/>
+            </w:pPr>
+            <w:r>
+              <w:t xml:space="preserve">Tutor adaptativo</w:t>
             </w:r>
           </w:p>
         </w:tc>
@@ -2930,7 +2962,7 @@
           <w:b/>
           <w:bCs/>
         </w:rPr>
-        <w:t xml:space="preserve">Preguntas abiertas del modelo de conocimiento (O1 a O10):</w:t>
+        <w:t xml:space="preserve">Preguntas abiertas del modelo de conocimiento (O1 a O10 y N1 a N10, incluida la relación entre 70 % y K6):</w:t>
       </w:r>
       <w:r>
         <w:t xml:space="preserve"> </w:t>
@@ -2984,7 +3016,58 @@
         <w:pStyle w:val="Compact"/>
         <w:numPr>
           <w:ilvl w:val="0"/>
-          <w:numId w:val="1005"/>
+          <w:numId w:val="1004"/>
+        </w:numPr>
+      </w:pPr>
+      <w:r>
+        <w:rPr>
+          <w:rStyle w:val="VerbatimChar"/>
+        </w:rPr>
+        <w:t xml:space="preserve">README.md</w:t>
+      </w:r>
+      <w:r>
+        <w:t xml:space="preserve">: índice y documento normativo por materia.</w:t>
+      </w:r>
+    </w:p>
+    <w:p>
+      <w:pPr>
+        <w:pStyle w:val="Compact"/>
+        <w:numPr>
+          <w:ilvl w:val="0"/>
+          <w:numId w:val="1004"/>
+        </w:numPr>
+      </w:pPr>
+      <w:r>
+        <w:rPr>
+          <w:rStyle w:val="VerbatimChar"/>
+        </w:rPr>
+        <w:t xml:space="preserve">CONTRADICCIONES_Y_PREGUNTAS.md</w:t>
+      </w:r>
+      <w:r>
+        <w:t xml:space="preserve"> </w:t>
+      </w:r>
+      <w:r>
+        <w:t xml:space="preserve">y</w:t>
+      </w:r>
+      <w:r>
+        <w:t xml:space="preserve"> </w:t>
+      </w:r>
+      <w:r>
+        <w:rPr>
+          <w:rStyle w:val="VerbatimChar"/>
+        </w:rPr>
+        <w:t xml:space="preserve">TRAZABILIDAD.md</w:t>
+      </w:r>
+      <w:r>
+        <w:t xml:space="preserve">: conflictos y matriz.</w:t>
+      </w:r>
+    </w:p>
+    <w:p>
+      <w:pPr>
+        <w:pStyle w:val="Compact"/>
+        <w:numPr>
+          <w:ilvl w:val="0"/>
+          <w:numId w:val="1004"/>
         </w:numPr>
       </w:pPr>
       <w:r>
@@ -3002,7 +3085,7 @@
         <w:pStyle w:val="Compact"/>
         <w:numPr>
           <w:ilvl w:val="0"/>
-          <w:numId w:val="1005"/>
+          <w:numId w:val="1004"/>
         </w:numPr>
       </w:pPr>
       <w:r>
@@ -3020,7 +3103,7 @@
         <w:pStyle w:val="Compact"/>
         <w:numPr>
           <w:ilvl w:val="0"/>
-          <w:numId w:val="1005"/>
+          <w:numId w:val="1004"/>
         </w:numPr>
       </w:pPr>
       <w:r>
@@ -3053,7 +3136,7 @@
         <w:pStyle w:val="Compact"/>
         <w:numPr>
           <w:ilvl w:val="0"/>
-          <w:numId w:val="1005"/>
+          <w:numId w:val="1004"/>
         </w:numPr>
       </w:pPr>
       <w:r>
@@ -3071,7 +3154,7 @@
         <w:pStyle w:val="Compact"/>
         <w:numPr>
           <w:ilvl w:val="0"/>
-          <w:numId w:val="1005"/>
+          <w:numId w:val="1004"/>
         </w:numPr>
       </w:pPr>
       <w:r>
@@ -3433,9 +3516,6 @@
     <w:abstractNumId w:val="991"/>
   </w:num>
   <w:num w:numId="1004">
-    <w:abstractNumId w:val="991"/>
-  </w:num>
-  <w:num w:numId="1005">
     <w:abstractNumId w:val="991"/>
   </w:num>
 </w:numbering>

</xml_diff>

<commit_message>
Vórtice: plan técnico de E0 y corrección de referencias a review_at
review_at por sí solo no libera resultados: las referencias apuntan a la condición
completa de publicación. Plan de E0 especificado, sin ejecutar.

Solo documentación: sin base creada, sin pruebas ejecutadas, sin cambios de código ni producción.

Co-Authored-By: Claude Opus 5.5 <noreply@anthropic.com>
</commit_message>
<xml_diff>
--- a/docs/p0e/APRENDIZAJE_TEORICO_VORTICE.docx
+++ b/docs/p0e/APRENDIZAJE_TEORICO_VORTICE.docx
@@ -1183,10 +1183,7 @@
               <w:pStyle w:val="Compact"/>
             </w:pPr>
             <w:r>
-              <w:t xml:space="preserve">Las prácticas dan feedback inmediato por contenido; el cierre conserva el retraso hasta</w:t>
-            </w:r>
-            <w:r>
-              <w:t xml:space="preserve"> </w:t>
+              <w:t xml:space="preserve">Las prácticas dan feedback inmediato por contenido; el cierre conserva el retraso hasta la publicación (</w:t>
             </w:r>
             <w:r>
               <w:rPr>
@@ -1195,7 +1192,10 @@
               <w:t xml:space="preserve">review_at</w:t>
             </w:r>
             <w:r>
-              <w:t xml:space="preserve">.</w:t>
+              <w:t xml:space="preserve"> </w:t>
+            </w:r>
+            <w:r>
+              <w:t xml:space="preserve">y versión cerrada).</w:t>
             </w:r>
           </w:p>
         </w:tc>
@@ -1813,10 +1813,7 @@
               <w:pStyle w:val="Compact"/>
             </w:pPr>
             <w:r>
-              <w:t xml:space="preserve">Durante el proceso solo se muestra el estado. Porcentaje, banda y contenidos no logrados aparecen al cierre, desde</w:t>
-            </w:r>
-            <w:r>
-              <w:t xml:space="preserve"> </w:t>
+              <w:t xml:space="preserve">Durante el proceso solo se muestra el estado. Porcentaje, banda y contenidos no logrados aparecen al cierre, al publicarse (</w:t>
             </w:r>
             <w:r>
               <w:rPr>
@@ -1825,7 +1822,10 @@
               <w:t xml:space="preserve">review_at</w:t>
             </w:r>
             <w:r>
-              <w:t xml:space="preserve">.</w:t>
+              <w:t xml:space="preserve"> </w:t>
+            </w:r>
+            <w:r>
+              <w:t xml:space="preserve">y versión cerrada).</w:t>
             </w:r>
           </w:p>
         </w:tc>

</xml_diff>